<commit_message>
Align gate pass wording with final approved text
Update DOCX/PDF for Mr. Rajesh Gulati consignee, demonstration and
technical evaluation phrasing, and Sahil Patni sign-off order.

Co-authored-by: Sahil Patni <sahilpat28@users.noreply.github.com>
</commit_message>
<xml_diff>
--- a/docs/GatePass_Cyclone10GX_SahilPatni_BEL_Panchkula.docx
+++ b/docs/GatePass_Cyclone10GX_SahilPatni_BEL_Panchkula.docx
@@ -4,7 +4,7 @@
   <w:body>
     <w:p>
       <w:pPr>
-        <w:spacing w:after="80"/>
+        <w:spacing w:after="80" w:before="0"/>
         <w:jc w:val="center"/>
       </w:pPr>
       <w:r>
@@ -113,7 +113,6 @@
     <w:tbl>
       <w:tblPr>
         <w:tblW w:type="auto" w:w="0"/>
-        <w:tblLayout w:type="autofit"/>
         <w:tblLook w:firstColumn="1" w:firstRow="1" w:lastColumn="0" w:lastRow="0" w:noHBand="0" w:noVBand="1" w:val="04A0"/>
       </w:tblPr>
       <w:tblGrid>
@@ -231,7 +230,7 @@
           <w:b w:val="0"/>
           <w:sz w:val="22"/>
         </w:rPr>
-        <w:t>) for demonstration / technical evaluation purposes.</w:t>
+        <w:t>) for demonstration and technical evaluation purposes.</w:t>
       </w:r>
     </w:p>
     <w:p>
@@ -259,7 +258,7 @@
           <w:b/>
           <w:sz w:val="20"/>
         </w:rPr>
-        <w:t>Rajesh Gulati</w:t>
+        <w:t>Mr. Rajesh Gulati</w:t>
       </w:r>
     </w:p>
     <w:p>
@@ -592,7 +591,7 @@
     </w:p>
     <w:p>
       <w:pPr>
-        <w:spacing w:after="200" w:before="0"/>
+        <w:spacing w:after="0" w:before="0"/>
         <w:jc w:val="left"/>
       </w:pPr>
       <w:r>
@@ -601,7 +600,7 @@
           <w:b/>
           <w:sz w:val="22"/>
         </w:rPr>
-        <w:t>Altera Semiconductor Technology India Pvt. Ltd.</w:t>
+        <w:t>Sahil Patni</w:t>
       </w:r>
     </w:p>
     <w:p>
@@ -615,7 +614,7 @@
           <w:b/>
           <w:sz w:val="22"/>
         </w:rPr>
-        <w:t>Sahil Patni</w:t>
+        <w:t>Altera Semiconductor Technology India Pvt. Ltd.</w:t>
       </w:r>
     </w:p>
     <w:p>
@@ -662,20 +661,6 @@
     </w:p>
     <w:p>
       <w:pPr>
-        <w:spacing w:after="0" w:before="0"/>
-        <w:jc w:val="left"/>
-      </w:pPr>
-      <w:r>
-        <w:rPr>
-          <w:rFonts w:ascii="Calibri" w:hAnsi="Calibri" w:eastAsia="Calibri"/>
-          <w:b w:val="0"/>
-          <w:sz w:val="20"/>
-        </w:rPr>
-        <w:t>(Authorized Carrier)</w:t>
-      </w:r>
-    </w:p>
-    <w:p>
-      <w:pPr>
         <w:spacing w:after="160" w:before="320"/>
         <w:jc w:val="left"/>
       </w:pPr>
@@ -683,7 +668,6 @@
     <w:tbl>
       <w:tblPr>
         <w:tblW w:type="auto" w:w="0"/>
-        <w:tblLayout w:type="autofit"/>
         <w:tblLook w:firstColumn="1" w:firstRow="1" w:lastColumn="0" w:lastRow="0" w:noHBand="0" w:noVBand="1" w:val="04A0"/>
       </w:tblPr>
       <w:tblGrid>
@@ -823,7 +807,7 @@
                 <w:b w:val="0"/>
                 <w:sz w:val="20"/>
               </w:rPr>
-              <w:t>Rajesh Gulati</w:t>
+              <w:t>Mr. Rajesh Gulati</w:t>
             </w:r>
           </w:p>
           <w:p>

</xml_diff>